<commit_message>
Update to Project Topic Document
</commit_message>
<xml_diff>
--- a/Project/Document/CIS2232_ProjectTopic_OhanekwuRobert_Sybil.docx
+++ b/Project/Document/CIS2232_ProjectTopic_OhanekwuRobert_Sybil.docx
@@ -213,6 +213,43 @@
       </w:tr>
     </w:tbl>
     <w:p/>
+    <w:p>
+      <w:pPr>
+        <w:pStyle w:val="Heading1"/>
+      </w:pPr>
+      <w:r>
+        <w:t>Project Base Color</w:t>
+      </w:r>
+    </w:p>
+    <w:tbl>
+      <w:tblPr>
+        <w:tblStyle w:val="TableGrid"/>
+        <w:tblW w:w="0" w:type="auto"/>
+        <w:tblLook w:val="04A0" w:firstRow="1" w:lastRow="0" w:firstColumn="1" w:lastColumn="0" w:noHBand="0" w:noVBand="1"/>
+      </w:tblPr>
+      <w:tblGrid>
+        <w:gridCol w:w="4945"/>
+      </w:tblGrid>
+      <w:tr>
+        <w:tc>
+          <w:tcPr>
+            <w:tcW w:w="4945" w:type="dxa"/>
+            <w:tcBorders>
+              <w:top w:val="single" w:sz="4" w:space="0" w:color="auto"/>
+              <w:left w:val="single" w:sz="4" w:space="0" w:color="auto"/>
+              <w:bottom w:val="single" w:sz="4" w:space="0" w:color="auto"/>
+              <w:right w:val="single" w:sz="4" w:space="0" w:color="auto"/>
+            </w:tcBorders>
+            <w:hideMark/>
+          </w:tcPr>
+          <w:p>
+            <w:pPr>
+              <w:spacing w:after="160" w:line="259" w:lineRule="auto"/>
+            </w:pPr>
+          </w:p>
+        </w:tc>
+      </w:tr>
+    </w:tbl>
     <w:p>
       <w:pPr>
         <w:rPr>
@@ -1330,7 +1367,6 @@
   <w:style w:type="character" w:default="1" w:styleId="DefaultParagraphFont">
     <w:name w:val="Default Paragraph Font"/>
     <w:uiPriority w:val="1"/>
-    <w:semiHidden/>
     <w:unhideWhenUsed/>
   </w:style>
   <w:style w:type="table" w:default="1" w:styleId="TableNormal">

</xml_diff>